<commit_message>
chore: purge all legacy KCB references from frontend, docs, and design scripts — replaced with ZamuPay
</commit_message>
<xml_diff>
--- a/docs/Karibu_Credit_Technical_Design_v1.docx
+++ b/docs/Karibu_Credit_Technical_Design_v1.docx
@@ -426,7 +426,7 @@
       <w:r>
         <w:drawing>
           <wp:inline xmlns:a="http://schemas.openxmlformats.org/drawingml/2006/main" xmlns:pic="http://schemas.openxmlformats.org/drawingml/2006/picture">
-            <wp:extent cx="8686800" cy="6433092"/>
+            <wp:extent cx="8686800" cy="6428596"/>
             <wp:docPr id="3" name="Picture 3"/>
             <wp:cNvGraphicFramePr>
               <a:graphicFrameLocks noChangeAspect="1"/>
@@ -447,7 +447,7 @@
                   <pic:spPr>
                     <a:xfrm>
                       <a:off x="0" y="0"/>
-                      <a:ext cx="8686800" cy="6433092"/>
+                      <a:ext cx="8686800" cy="6428596"/>
                     </a:xfrm>
                     <a:prstGeom prst="rect"/>
                   </pic:spPr>
@@ -1007,7 +1007,7 @@
     </w:p>
     <w:p>
       <w:r>
-        <w:t>The Domain Layer is the inner-most layer. It must not import from Infrastructure. Application services orchestrate use cases by calling domain entities and repository ports. Infrastructure adapters (Daraja, KCB, SQLAlchemy) implement these ports.</w:t>
+        <w:t>The Domain Layer is the inner-most layer. It must not import from Infrastructure. Application services orchestrate use cases by calling domain entities and repository ports. Infrastructure adapters (Daraja, ZamuPay, SQLAlchemy) implement these ports.</w:t>
       </w:r>
     </w:p>
     <w:p>

</xml_diff>